<commit_message>
week8 until the ensemble prediction model
</commit_message>
<xml_diff>
--- a/week8/week8-notes.docx
+++ b/week8/week8-notes.docx
@@ -26,13 +26,12 @@
       <w:r>
         <w:rPr>
           <w:noProof/>
-          <w:lang w:val="fr-FR"/>
         </w:rPr>
         <w:drawing>
-          <wp:inline distT="0" distB="0" distL="0" distR="0" wp14:anchorId="0AED15BD" wp14:editId="06953268">
-            <wp:extent cx="5944154" cy="2933700"/>
-            <wp:effectExtent l="0" t="0" r="0" b="0"/>
-            <wp:docPr id="852187583" name="Picture 1"/>
+          <wp:inline distT="0" distB="0" distL="0" distR="0" wp14:anchorId="439A0526" wp14:editId="589D15F1">
+            <wp:extent cx="5426494" cy="2971800"/>
+            <wp:effectExtent l="0" t="0" r="3175" b="0"/>
+            <wp:docPr id="363663482" name="Picture 1"/>
             <wp:cNvGraphicFramePr>
               <a:graphicFrameLocks xmlns:a="http://schemas.openxmlformats.org/drawingml/2006/main" noChangeAspect="1"/>
             </wp:cNvGraphicFramePr>
@@ -61,7 +60,7 @@
                   <pic:spPr bwMode="auto">
                     <a:xfrm>
                       <a:off x="0" y="0"/>
-                      <a:ext cx="5946255" cy="2934737"/>
+                      <a:ext cx="5430188" cy="2973823"/>
                     </a:xfrm>
                     <a:prstGeom prst="rect">
                       <a:avLst/>
@@ -167,7 +166,7 @@
     <w:p/>
     <w:p>
       <w:pPr>
-        <w:pStyle w:val="Heading1"/>
+        <w:pStyle w:val="Heading2"/>
       </w:pPr>
       <w:r>
         <w:t>Modal</w:t>
@@ -181,6 +180,79 @@
     <w:p>
       <w:r>
         <w:t>You only pay for the compute time you use.</w:t>
+      </w:r>
+    </w:p>
+    <w:p/>
+    <w:p>
+      <w:pPr>
+        <w:pStyle w:val="Heading1"/>
+      </w:pPr>
+      <w:r>
+        <w:t>Predict techniques</w:t>
+      </w:r>
+    </w:p>
+    <w:p>
+      <w:pPr>
+        <w:pStyle w:val="Heading2"/>
+      </w:pPr>
+      <w:r>
+        <w:t>Specialist Agent</w:t>
+      </w:r>
+    </w:p>
+    <w:p>
+      <w:r>
+        <w:t>It is our Finetuned model deployed on Modal.</w:t>
+      </w:r>
+    </w:p>
+    <w:p>
+      <w:pPr>
+        <w:pStyle w:val="Heading2"/>
+      </w:pPr>
+      <w:r>
+        <w:t>Frontier Agent</w:t>
+      </w:r>
+    </w:p>
+    <w:p>
+      <w:r>
+        <w:t xml:space="preserve">It is a gpt4o-mini that makes a prediction </w:t>
+      </w:r>
+      <w:r>
+        <w:t>with a multi-shot prompt.</w:t>
+      </w:r>
+    </w:p>
+    <w:p>
+      <w:r>
+        <w:t>The multi shot is some examples of item + price retrieved from a Vectore Store . They are retrieved based on similarity with the requested item. The vectors are made with an Open source embedding model.</w:t>
+      </w:r>
+    </w:p>
+    <w:p>
+      <w:pPr>
+        <w:pStyle w:val="Heading2"/>
+      </w:pPr>
+      <w:r>
+        <w:lastRenderedPageBreak/>
+        <w:t>Random Forest Agent</w:t>
+      </w:r>
+    </w:p>
+    <w:p>
+      <w:r>
+        <w:t>A random</w:t>
+      </w:r>
+      <w:r>
+        <w:t xml:space="preserve"> forest trained with all the Training set but vectorized by the OpenSource embedding model.</w:t>
+      </w:r>
+    </w:p>
+    <w:p>
+      <w:pPr>
+        <w:pStyle w:val="Heading2"/>
+      </w:pPr>
+      <w:r>
+        <w:t>Ensemble Agent</w:t>
+      </w:r>
+    </w:p>
+    <w:p>
+      <w:r>
+        <w:t>Take the 3 prices prediction from the 3 model above and use a linear regression to predict a final price.</w:t>
       </w:r>
     </w:p>
     <w:sectPr>

</xml_diff>

<commit_message>
end of the class :)
</commit_message>
<xml_diff>
--- a/week8/week8-notes.docx
+++ b/week8/week8-notes.docx
@@ -253,6 +253,366 @@
     <w:p>
       <w:r>
         <w:t>Take the 3 prices prediction from the 3 model above and use a linear regression to predict a final price.</w:t>
+      </w:r>
+    </w:p>
+    <w:p/>
+    <w:p>
+      <w:pPr>
+        <w:pStyle w:val="Heading1"/>
+      </w:pPr>
+      <w:r>
+        <w:t>Structured outputs</w:t>
+      </w:r>
+    </w:p>
+    <w:p>
+      <w:r>
+        <w:t>A way to define how you want the LLM to return the output.</w:t>
+      </w:r>
+    </w:p>
+    <w:p>
+      <w:r>
+        <w:rPr>
+          <w:noProof/>
+        </w:rPr>
+        <w:drawing>
+          <wp:inline distT="0" distB="0" distL="0" distR="0" wp14:anchorId="0139DC49" wp14:editId="599771E2">
+            <wp:extent cx="3638550" cy="2381250"/>
+            <wp:effectExtent l="0" t="0" r="0" b="0"/>
+            <wp:docPr id="116433181" name="Picture 1"/>
+            <wp:cNvGraphicFramePr>
+              <a:graphicFrameLocks xmlns:a="http://schemas.openxmlformats.org/drawingml/2006/main" noChangeAspect="1"/>
+            </wp:cNvGraphicFramePr>
+            <a:graphic xmlns:a="http://schemas.openxmlformats.org/drawingml/2006/main">
+              <a:graphicData uri="http://schemas.openxmlformats.org/drawingml/2006/picture">
+                <pic:pic xmlns:pic="http://schemas.openxmlformats.org/drawingml/2006/picture">
+                  <pic:nvPicPr>
+                    <pic:cNvPr id="0" name="Picture 1"/>
+                    <pic:cNvPicPr>
+                      <a:picLocks noChangeAspect="1" noChangeArrowheads="1"/>
+                    </pic:cNvPicPr>
+                  </pic:nvPicPr>
+                  <pic:blipFill>
+                    <a:blip r:embed="rId6">
+                      <a:extLst>
+                        <a:ext uri="{28A0092B-C50C-407E-A947-70E740481C1C}">
+                          <a14:useLocalDpi xmlns:a14="http://schemas.microsoft.com/office/drawing/2010/main" val="0"/>
+                        </a:ext>
+                      </a:extLst>
+                    </a:blip>
+                    <a:srcRect/>
+                    <a:stretch>
+                      <a:fillRect/>
+                    </a:stretch>
+                  </pic:blipFill>
+                  <pic:spPr bwMode="auto">
+                    <a:xfrm>
+                      <a:off x="0" y="0"/>
+                      <a:ext cx="3638550" cy="2381250"/>
+                    </a:xfrm>
+                    <a:prstGeom prst="rect">
+                      <a:avLst/>
+                    </a:prstGeom>
+                    <a:noFill/>
+                    <a:ln>
+                      <a:noFill/>
+                    </a:ln>
+                  </pic:spPr>
+                </pic:pic>
+              </a:graphicData>
+            </a:graphic>
+          </wp:inline>
+        </w:drawing>
+      </w:r>
+    </w:p>
+    <w:p/>
+    <w:p>
+      <w:r>
+        <w:t>Tool/function call is used when you want to execute code, and it can return an output in the format you want.</w:t>
+      </w:r>
+    </w:p>
+    <w:p>
+      <w:r>
+        <w:t>If you just want to return the output in the format you want Structured output is simpler.</w:t>
+      </w:r>
+    </w:p>
+    <w:p>
+      <w:pPr>
+        <w:pStyle w:val="Heading2"/>
+      </w:pPr>
+      <w:r>
+        <w:t>Pydantic</w:t>
+      </w:r>
+    </w:p>
+    <w:p>
+      <w:r>
+        <w:t>We use pydantic to define the output. Pydantic is a library to translate json objects to python classes and enforce validation.</w:t>
+      </w:r>
+    </w:p>
+    <w:p/>
+    <w:p/>
+    <w:p/>
+    <w:p/>
+    <w:p>
+      <w:pPr>
+        <w:pStyle w:val="Heading1"/>
+      </w:pPr>
+      <w:r>
+        <w:t>Agentic AI</w:t>
+      </w:r>
+    </w:p>
+    <w:p>
+      <w:r>
+        <w:t>Several Framework provide tools to build agentic ai:</w:t>
+      </w:r>
+    </w:p>
+    <w:p>
+      <w:pPr>
+        <w:pStyle w:val="ListParagraph"/>
+        <w:numPr>
+          <w:ilvl w:val="0"/>
+          <w:numId w:val="11"/>
+        </w:numPr>
+      </w:pPr>
+      <w:r>
+        <w:t>LangChain</w:t>
+      </w:r>
+    </w:p>
+    <w:p>
+      <w:pPr>
+        <w:pStyle w:val="ListParagraph"/>
+        <w:numPr>
+          <w:ilvl w:val="0"/>
+          <w:numId w:val="11"/>
+        </w:numPr>
+      </w:pPr>
+      <w:r>
+        <w:t>HuggingFace</w:t>
+      </w:r>
+    </w:p>
+    <w:p>
+      <w:r>
+        <w:t>In this course we’ll try to build everything ourself.</w:t>
+      </w:r>
+    </w:p>
+    <w:p>
+      <w:r>
+        <w:t>Agentic AI often have a Planning Agent to coordinate, this is often an LLM.</w:t>
+      </w:r>
+    </w:p>
+    <w:p>
+      <w:r>
+        <w:t>Agentic AI also have autonomy and memory.</w:t>
+      </w:r>
+    </w:p>
+    <w:p>
+      <w:r>
+        <w:rPr>
+          <w:noProof/>
+        </w:rPr>
+        <w:lastRenderedPageBreak/>
+        <w:drawing>
+          <wp:inline distT="0" distB="0" distL="0" distR="0" wp14:anchorId="1F9F91F6" wp14:editId="531713F7">
+            <wp:extent cx="5781675" cy="3036002"/>
+            <wp:effectExtent l="0" t="0" r="0" b="0"/>
+            <wp:docPr id="1429198754" name="Picture 1"/>
+            <wp:cNvGraphicFramePr>
+              <a:graphicFrameLocks xmlns:a="http://schemas.openxmlformats.org/drawingml/2006/main" noChangeAspect="1"/>
+            </wp:cNvGraphicFramePr>
+            <a:graphic xmlns:a="http://schemas.openxmlformats.org/drawingml/2006/main">
+              <a:graphicData uri="http://schemas.openxmlformats.org/drawingml/2006/picture">
+                <pic:pic xmlns:pic="http://schemas.openxmlformats.org/drawingml/2006/picture">
+                  <pic:nvPicPr>
+                    <pic:cNvPr id="0" name="Picture 1"/>
+                    <pic:cNvPicPr>
+                      <a:picLocks noChangeAspect="1" noChangeArrowheads="1"/>
+                    </pic:cNvPicPr>
+                  </pic:nvPicPr>
+                  <pic:blipFill>
+                    <a:blip r:embed="rId7">
+                      <a:extLst>
+                        <a:ext uri="{28A0092B-C50C-407E-A947-70E740481C1C}">
+                          <a14:useLocalDpi xmlns:a14="http://schemas.microsoft.com/office/drawing/2010/main" val="0"/>
+                        </a:ext>
+                      </a:extLst>
+                    </a:blip>
+                    <a:srcRect/>
+                    <a:stretch>
+                      <a:fillRect/>
+                    </a:stretch>
+                  </pic:blipFill>
+                  <pic:spPr bwMode="auto">
+                    <a:xfrm>
+                      <a:off x="0" y="0"/>
+                      <a:ext cx="5797674" cy="3044403"/>
+                    </a:xfrm>
+                    <a:prstGeom prst="rect">
+                      <a:avLst/>
+                    </a:prstGeom>
+                    <a:noFill/>
+                    <a:ln>
+                      <a:noFill/>
+                    </a:ln>
+                  </pic:spPr>
+                </pic:pic>
+              </a:graphicData>
+            </a:graphic>
+          </wp:inline>
+        </w:drawing>
+      </w:r>
+    </w:p>
+    <w:p/>
+    <w:p>
+      <w:pPr>
+        <w:keepNext/>
+      </w:pPr>
+      <w:r>
+        <w:rPr>
+          <w:noProof/>
+        </w:rPr>
+        <w:drawing>
+          <wp:inline distT="0" distB="0" distL="0" distR="0" wp14:anchorId="3D730B51" wp14:editId="75CA6348">
+            <wp:extent cx="5345628" cy="2952750"/>
+            <wp:effectExtent l="0" t="0" r="7620" b="0"/>
+            <wp:docPr id="91969996" name="Picture 2"/>
+            <wp:cNvGraphicFramePr>
+              <a:graphicFrameLocks xmlns:a="http://schemas.openxmlformats.org/drawingml/2006/main" noChangeAspect="1"/>
+            </wp:cNvGraphicFramePr>
+            <a:graphic xmlns:a="http://schemas.openxmlformats.org/drawingml/2006/main">
+              <a:graphicData uri="http://schemas.openxmlformats.org/drawingml/2006/picture">
+                <pic:pic xmlns:pic="http://schemas.openxmlformats.org/drawingml/2006/picture">
+                  <pic:nvPicPr>
+                    <pic:cNvPr id="0" name="Picture 2"/>
+                    <pic:cNvPicPr>
+                      <a:picLocks noChangeAspect="1" noChangeArrowheads="1"/>
+                    </pic:cNvPicPr>
+                  </pic:nvPicPr>
+                  <pic:blipFill>
+                    <a:blip r:embed="rId8">
+                      <a:extLst>
+                        <a:ext uri="{28A0092B-C50C-407E-A947-70E740481C1C}">
+                          <a14:useLocalDpi xmlns:a14="http://schemas.microsoft.com/office/drawing/2010/main" val="0"/>
+                        </a:ext>
+                      </a:extLst>
+                    </a:blip>
+                    <a:srcRect/>
+                    <a:stretch>
+                      <a:fillRect/>
+                    </a:stretch>
+                  </pic:blipFill>
+                  <pic:spPr bwMode="auto">
+                    <a:xfrm>
+                      <a:off x="0" y="0"/>
+                      <a:ext cx="5351124" cy="2955786"/>
+                    </a:xfrm>
+                    <a:prstGeom prst="rect">
+                      <a:avLst/>
+                    </a:prstGeom>
+                    <a:noFill/>
+                    <a:ln>
+                      <a:noFill/>
+                    </a:ln>
+                  </pic:spPr>
+                </pic:pic>
+              </a:graphicData>
+            </a:graphic>
+          </wp:inline>
+        </w:drawing>
+      </w:r>
+    </w:p>
+    <w:p>
+      <w:pPr>
+        <w:pStyle w:val="Caption"/>
+      </w:pPr>
+      <w:r>
+        <w:t xml:space="preserve">Figure </w:t>
+      </w:r>
+      <w:r>
+        <w:fldChar w:fldCharType="begin"/>
+      </w:r>
+      <w:r>
+        <w:instrText xml:space="preserve"> SEQ Figure \* ARABIC </w:instrText>
+      </w:r>
+      <w:r>
+        <w:fldChar w:fldCharType="separate"/>
+      </w:r>
+      <w:r>
+        <w:rPr>
+          <w:noProof/>
+        </w:rPr>
+        <w:t>2</w:t>
+      </w:r>
+      <w:r>
+        <w:fldChar w:fldCharType="end"/>
+      </w:r>
+      <w:r>
+        <w:t>: The Agentic parts are in yellow in this picture.</w:t>
+      </w:r>
+    </w:p>
+    <w:p/>
+    <w:p>
+      <w:pPr>
+        <w:pStyle w:val="Heading2"/>
+      </w:pPr>
+      <w:r>
+        <w:t>The Agent Framework</w:t>
+      </w:r>
+    </w:p>
+    <w:p>
+      <w:r>
+        <w:t>This is suppose to handle:</w:t>
+      </w:r>
+    </w:p>
+    <w:p>
+      <w:pPr>
+        <w:pStyle w:val="ListParagraph"/>
+        <w:numPr>
+          <w:ilvl w:val="0"/>
+          <w:numId w:val="11"/>
+        </w:numPr>
+      </w:pPr>
+      <w:r>
+        <w:t xml:space="preserve"> DataBase connectivity.</w:t>
+      </w:r>
+    </w:p>
+    <w:p>
+      <w:pPr>
+        <w:pStyle w:val="ListParagraph"/>
+        <w:numPr>
+          <w:ilvl w:val="0"/>
+          <w:numId w:val="11"/>
+        </w:numPr>
+      </w:pPr>
+      <w:r>
+        <w:t>Logging.</w:t>
+      </w:r>
+    </w:p>
+    <w:p>
+      <w:pPr>
+        <w:pStyle w:val="ListParagraph"/>
+        <w:numPr>
+          <w:ilvl w:val="0"/>
+          <w:numId w:val="11"/>
+        </w:numPr>
+      </w:pPr>
+      <w:r>
+        <w:t>env variables.</w:t>
+      </w:r>
+    </w:p>
+    <w:p>
+      <w:pPr>
+        <w:pStyle w:val="ListParagraph"/>
+        <w:numPr>
+          <w:ilvl w:val="0"/>
+          <w:numId w:val="11"/>
+        </w:numPr>
+      </w:pPr>
+      <w:r>
+        <w:t>Persistent Memory.</w:t>
+      </w:r>
+    </w:p>
+    <w:p>
+      <w:r>
+        <w:t>In our case the memory is a json file called memory.json. Typically that would be a DB.</w:t>
       </w:r>
     </w:p>
     <w:sectPr>

</xml_diff>